<commit_message>
Words con Campos Completado
</commit_message>
<xml_diff>
--- a/webapp/pdf/Contrato_Aprendizaje_Lectivo.docx
+++ b/webapp/pdf/Contrato_Aprendizaje_Lectivo.docx
@@ -1,6 +1,6 @@
 
 <file path=word/document.xml><?xml version="1.0" encoding="utf-8"?>
-<w:document xmlns:wpc="http://schemas.microsoft.com/office/word/2010/wordprocessingCanvas" xmlns:cx="http://schemas.microsoft.com/office/drawing/2014/chartex" xmlns:cx1="http://schemas.microsoft.com/office/drawing/2015/9/8/chartex" xmlns:cx2="http://schemas.microsoft.com/office/drawing/2015/10/21/chartex" xmlns:cx3="http://schemas.microsoft.com/office/drawing/2016/5/9/chartex" xmlns:cx4="http://schemas.microsoft.com/office/drawing/2016/5/10/chartex" xmlns:cx5="http://schemas.microsoft.com/office/drawing/2016/5/11/chartex" xmlns:cx6="http://schemas.microsoft.com/office/drawing/2016/5/12/chartex" xmlns:cx7="http://schemas.microsoft.com/office/drawing/2016/5/13/chartex" xmlns:cx8="http://schemas.microsoft.com/office/drawing/2016/5/14/chartex" xmlns:mc="http://schemas.openxmlformats.org/markup-compatibility/2006" xmlns:aink="http://schemas.microsoft.com/office/drawing/2016/ink" xmlns:am3d="http://schemas.microsoft.com/office/drawing/2017/model3d" xmlns:o="urn:schemas-microsoft-com:office:office" xmlns:oel="http://schemas.microsoft.com/office/2019/extlst" xmlns:r="http://schemas.openxmlformats.org/officeDocument/2006/relationships" xmlns:m="http://schemas.openxmlformats.org/officeDocument/2006/math" xmlns:v="urn:schemas-microsoft-com:vml" xmlns:wp14="http://schemas.microsoft.com/office/word/2010/wordprocessingDrawing" xmlns:wp="http://schemas.openxmlformats.org/drawingml/2006/wordprocessingDrawing" xmlns:w10="urn:schemas-microsoft-com:office:word" xmlns:w="http://schemas.openxmlformats.org/wordprocessingml/2006/main" xmlns:w14="http://schemas.microsoft.com/office/word/2010/wordml" xmlns:w15="http://schemas.microsoft.com/office/word/2012/wordml" xmlns:w16cex="http://schemas.microsoft.com/office/word/2018/wordml/cex" xmlns:w16cid="http://schemas.microsoft.com/office/word/2016/wordml/cid" xmlns:w16="http://schemas.microsoft.com/office/word/2018/wordml" xmlns:w16du="http://schemas.microsoft.com/office/word/2023/wordml/word16du" xmlns:w16sdtdh="http://schemas.microsoft.com/office/word/2020/wordml/sdtdatahash" xmlns:w16sdtfl="http://schemas.microsoft.com/office/word/2024/wordml/sdtformatlock" xmlns:w16se="http://schemas.microsoft.com/office/word/2015/wordml/symex" xmlns:wpg="http://schemas.microsoft.com/office/word/2010/wordprocessingGroup" xmlns:wpi="http://schemas.microsoft.com/office/word/2010/wordprocessingInk" xmlns:wne="http://schemas.microsoft.com/office/word/2006/wordml" xmlns:wps="http://schemas.microsoft.com/office/word/2010/wordprocessingShape" mc:Ignorable="w14 w15 w16se w16cid w16 w16cex w16sdtdh w16sdtfl w16du wp14">
+<w:document xmlns:wpc="http://schemas.microsoft.com/office/word/2010/wordprocessingCanvas" xmlns:cx="http://schemas.microsoft.com/office/drawing/2014/chartex" xmlns:cx1="http://schemas.microsoft.com/office/drawing/2015/9/8/chartex" xmlns:cx2="http://schemas.microsoft.com/office/drawing/2015/10/21/chartex" xmlns:cx3="http://schemas.microsoft.com/office/drawing/2016/5/9/chartex" xmlns:cx4="http://schemas.microsoft.com/office/drawing/2016/5/10/chartex" xmlns:cx5="http://schemas.microsoft.com/office/drawing/2016/5/11/chartex" xmlns:cx6="http://schemas.microsoft.com/office/drawing/2016/5/12/chartex" xmlns:cx7="http://schemas.microsoft.com/office/drawing/2016/5/13/chartex" xmlns:cx8="http://schemas.microsoft.com/office/drawing/2016/5/14/chartex" xmlns:mc="http://schemas.openxmlformats.org/markup-compatibility/2006" xmlns:aink="http://schemas.microsoft.com/office/drawing/2016/ink" xmlns:am3d="http://schemas.microsoft.com/office/drawing/2017/model3d" xmlns:o="urn:schemas-microsoft-com:office:office" xmlns:r="http://schemas.openxmlformats.org/officeDocument/2006/relationships" xmlns:m="http://schemas.openxmlformats.org/officeDocument/2006/math" xmlns:v="urn:schemas-microsoft-com:vml" xmlns:wp14="http://schemas.microsoft.com/office/word/2010/wordprocessingDrawing" xmlns:wp="http://schemas.openxmlformats.org/drawingml/2006/wordprocessingDrawing" xmlns:w10="urn:schemas-microsoft-com:office:word" xmlns:w="http://schemas.openxmlformats.org/wordprocessingml/2006/main" xmlns:w14="http://schemas.microsoft.com/office/word/2010/wordml" xmlns:w15="http://schemas.microsoft.com/office/word/2012/wordml" xmlns:w16cex="http://schemas.microsoft.com/office/word/2018/wordml/cex" xmlns:w16cid="http://schemas.microsoft.com/office/word/2016/wordml/cid" xmlns:w16="http://schemas.microsoft.com/office/word/2018/wordml" xmlns:w16sdtdh="http://schemas.microsoft.com/office/word/2020/wordml/sdtdatahash" xmlns:w16se="http://schemas.microsoft.com/office/word/2015/wordml/symex" xmlns:wpg="http://schemas.microsoft.com/office/word/2010/wordprocessingGroup" xmlns:wpi="http://schemas.microsoft.com/office/word/2010/wordprocessingInk" xmlns:wne="http://schemas.microsoft.com/office/word/2006/wordml" xmlns:wps="http://schemas.microsoft.com/office/word/2010/wordprocessingShape" mc:Ignorable="w14 w15 w16se w16cid w16 w16cex w16sdtdh wp14">
   <w:body>
     <w:p>
       <w:pPr>
@@ -496,6 +496,12 @@
             </w:pPr>
             <w:bookmarkStart w:id="7" w:name="nombre_aprenediz"/>
             <w:bookmarkEnd w:id="7"/>
+            <w:r>
+              <w:rPr>
+                <w:rFonts w:ascii="Calibri" w:eastAsia="Calibri" w:hAnsi="Calibri" w:cs="Calibri"/>
+              </w:rPr>
+              <w:t>[[Nombre]]</w:t>
+            </w:r>
           </w:p>
         </w:tc>
       </w:tr>
@@ -537,6 +543,12 @@
             </w:pPr>
             <w:bookmarkStart w:id="8" w:name="cedula_aprendiz"/>
             <w:bookmarkEnd w:id="8"/>
+            <w:r>
+              <w:rPr>
+                <w:rFonts w:ascii="Calibri" w:eastAsia="Calibri" w:hAnsi="Calibri" w:cs="Calibri"/>
+              </w:rPr>
+              <w:t>[[Cedula]]</w:t>
+            </w:r>
           </w:p>
         </w:tc>
       </w:tr>
@@ -578,6 +590,26 @@
             </w:pPr>
             <w:bookmarkStart w:id="9" w:name="fecha_nacimiento"/>
             <w:bookmarkEnd w:id="9"/>
+            <w:r>
+              <w:rPr>
+                <w:rFonts w:ascii="Calibri" w:eastAsia="Calibri" w:hAnsi="Calibri" w:cs="Calibri"/>
+              </w:rPr>
+              <w:t>[[</w:t>
+            </w:r>
+            <w:proofErr w:type="spellStart"/>
+            <w:r>
+              <w:rPr>
+                <w:rFonts w:ascii="Calibri" w:eastAsia="Calibri" w:hAnsi="Calibri" w:cs="Calibri"/>
+              </w:rPr>
+              <w:t>FechaNacimiento</w:t>
+            </w:r>
+            <w:proofErr w:type="spellEnd"/>
+            <w:r>
+              <w:rPr>
+                <w:rFonts w:ascii="Calibri" w:eastAsia="Calibri" w:hAnsi="Calibri" w:cs="Calibri"/>
+              </w:rPr>
+              <w:t>]]</w:t>
+            </w:r>
           </w:p>
         </w:tc>
       </w:tr>
@@ -617,6 +649,26 @@
                 <w:rFonts w:ascii="Calibri Light" w:hAnsi="Calibri Light" w:cs="Calibri Light"/>
               </w:rPr>
             </w:pPr>
+            <w:r>
+              <w:rPr>
+                <w:rFonts w:ascii="Calibri" w:eastAsia="Calibri" w:hAnsi="Calibri" w:cs="Calibri"/>
+              </w:rPr>
+              <w:t>[[</w:t>
+            </w:r>
+            <w:proofErr w:type="spellStart"/>
+            <w:r>
+              <w:rPr>
+                <w:rFonts w:ascii="Calibri" w:eastAsia="Calibri" w:hAnsi="Calibri" w:cs="Calibri"/>
+              </w:rPr>
+              <w:t>Direccion</w:t>
+            </w:r>
+            <w:proofErr w:type="spellEnd"/>
+            <w:r>
+              <w:rPr>
+                <w:rFonts w:ascii="Calibri" w:eastAsia="Calibri" w:hAnsi="Calibri" w:cs="Calibri"/>
+              </w:rPr>
+              <w:t>]]</w:t>
+            </w:r>
           </w:p>
         </w:tc>
       </w:tr>
@@ -659,6 +711,26 @@
                 <w:rFonts w:ascii="Calibri Light" w:hAnsi="Calibri Light" w:cs="Calibri Light"/>
               </w:rPr>
             </w:pPr>
+            <w:r>
+              <w:rPr>
+                <w:rFonts w:ascii="Calibri" w:eastAsia="Calibri" w:hAnsi="Calibri" w:cs="Calibri"/>
+              </w:rPr>
+              <w:t>[[</w:t>
+            </w:r>
+            <w:proofErr w:type="spellStart"/>
+            <w:r>
+              <w:rPr>
+                <w:rFonts w:ascii="Calibri" w:eastAsia="Calibri" w:hAnsi="Calibri" w:cs="Calibri"/>
+              </w:rPr>
+              <w:t>Telefono</w:t>
+            </w:r>
+            <w:proofErr w:type="spellEnd"/>
+            <w:r>
+              <w:rPr>
+                <w:rFonts w:ascii="Calibri" w:eastAsia="Calibri" w:hAnsi="Calibri" w:cs="Calibri"/>
+              </w:rPr>
+              <w:t>]]</w:t>
+            </w:r>
           </w:p>
         </w:tc>
       </w:tr>
@@ -700,6 +772,26 @@
             </w:pPr>
             <w:bookmarkStart w:id="10" w:name="fecha_inicio_contrato"/>
             <w:bookmarkEnd w:id="10"/>
+            <w:r>
+              <w:rPr>
+                <w:rFonts w:ascii="Calibri" w:eastAsia="Calibri" w:hAnsi="Calibri" w:cs="Calibri"/>
+              </w:rPr>
+              <w:t>[[</w:t>
+            </w:r>
+            <w:proofErr w:type="spellStart"/>
+            <w:r>
+              <w:rPr>
+                <w:rFonts w:ascii="Calibri" w:eastAsia="Calibri" w:hAnsi="Calibri" w:cs="Calibri"/>
+              </w:rPr>
+              <w:t>FechaContratacion</w:t>
+            </w:r>
+            <w:proofErr w:type="spellEnd"/>
+            <w:r>
+              <w:rPr>
+                <w:rFonts w:ascii="Calibri" w:eastAsia="Calibri" w:hAnsi="Calibri" w:cs="Calibri"/>
+              </w:rPr>
+              <w:t>]]</w:t>
+            </w:r>
           </w:p>
         </w:tc>
       </w:tr>
@@ -812,6 +904,26 @@
                 <w:bCs/>
               </w:rPr>
             </w:pPr>
+            <w:r>
+              <w:rPr>
+                <w:rFonts w:ascii="Calibri" w:eastAsia="Calibri" w:hAnsi="Calibri" w:cs="Calibri"/>
+              </w:rPr>
+              <w:t>[[</w:t>
+            </w:r>
+            <w:proofErr w:type="spellStart"/>
+            <w:r>
+              <w:rPr>
+                <w:rFonts w:ascii="Calibri" w:eastAsia="Calibri" w:hAnsi="Calibri" w:cs="Calibri"/>
+              </w:rPr>
+              <w:t>Institucion</w:t>
+            </w:r>
+            <w:proofErr w:type="spellEnd"/>
+            <w:r>
+              <w:rPr>
+                <w:rFonts w:ascii="Calibri" w:eastAsia="Calibri" w:hAnsi="Calibri" w:cs="Calibri"/>
+              </w:rPr>
+              <w:t>]]</w:t>
+            </w:r>
           </w:p>
         </w:tc>
       </w:tr>
@@ -959,16 +1071,13 @@
       </w:r>
       <w:r>
         <w:rPr>
-          <w:rFonts w:ascii="Calibri Light" w:hAnsi="Calibri Light" w:cs="Calibri Light"/>
-          <w:b/>
-          <w:bCs/>
-        </w:rPr>
-        <w:t>XXXXXXXXXXXXXXX</w:t>
-      </w:r>
-      <w:r>
-        <w:rPr>
-          <w:rFonts w:ascii="Calibri Light" w:hAnsi="Calibri Light" w:cs="Calibri Light"/>
-          <w:bCs/>
+          <w:rFonts w:ascii="Calibri" w:eastAsia="Calibri" w:hAnsi="Calibri" w:cs="Calibri"/>
+        </w:rPr>
+        <w:t>[[Nombre]]</w:t>
+      </w:r>
+      <w:r>
+        <w:rPr>
+          <w:rFonts w:ascii="Calibri" w:eastAsia="Calibri" w:hAnsi="Calibri" w:cs="Calibri"/>
         </w:rPr>
         <w:t xml:space="preserve"> </w:t>
       </w:r>
@@ -1018,32 +1127,62 @@
       </w:r>
       <w:r>
         <w:rPr>
-          <w:rFonts w:ascii="Calibri Light" w:hAnsi="Calibri Light" w:cs="Calibri Light"/>
-          <w:b/>
-          <w:bCs/>
-        </w:rPr>
-        <w:t>XXXXXXXXXXXXX</w:t>
-      </w:r>
-      <w:r>
-        <w:rPr>
-          <w:rFonts w:ascii="Calibri Light" w:hAnsi="Calibri Light" w:cs="Calibri Light"/>
-          <w:bCs/>
-        </w:rPr>
-        <w:t xml:space="preserve"> Expedida en</w:t>
-      </w:r>
-      <w:r>
-        <w:rPr>
-          <w:rFonts w:ascii="Calibri Light" w:hAnsi="Calibri Light" w:cs="Calibri Light"/>
-          <w:bCs/>
+          <w:rFonts w:ascii="Calibri" w:eastAsia="Calibri" w:hAnsi="Calibri" w:cs="Calibri"/>
+        </w:rPr>
+        <w:t>[[Cedula]]</w:t>
+      </w:r>
+      <w:r>
+        <w:rPr>
+          <w:rFonts w:ascii="Calibri" w:eastAsia="Calibri" w:hAnsi="Calibri" w:cs="Calibri"/>
         </w:rPr>
         <w:t xml:space="preserve"> </w:t>
       </w:r>
       <w:r>
         <w:rPr>
           <w:rFonts w:ascii="Calibri Light" w:hAnsi="Calibri Light" w:cs="Calibri Light"/>
-          <w:b/>
-        </w:rPr>
-        <w:t>XXXXXXXXXXXXXX</w:t>
+          <w:bCs/>
+        </w:rPr>
+        <w:t>Expedida en</w:t>
+      </w:r>
+      <w:r>
+        <w:rPr>
+          <w:rFonts w:ascii="Calibri Light" w:hAnsi="Calibri Light" w:cs="Calibri Light"/>
+          <w:bCs/>
+        </w:rPr>
+        <w:t xml:space="preserve"> </w:t>
+      </w:r>
+      <w:r>
+        <w:rPr>
+          <w:rFonts w:ascii="Calibri" w:eastAsia="Calibri" w:hAnsi="Calibri" w:cs="Calibri"/>
+        </w:rPr>
+        <w:t>[[</w:t>
+      </w:r>
+      <w:proofErr w:type="spellStart"/>
+      <w:r>
+        <w:rPr>
+          <w:rFonts w:ascii="Calibri" w:eastAsia="Calibri" w:hAnsi="Calibri" w:cs="Calibri"/>
+        </w:rPr>
+        <w:t>CiudadWork</w:t>
+      </w:r>
+      <w:proofErr w:type="spellEnd"/>
+      <w:r>
+        <w:rPr>
+          <w:rFonts w:ascii="Calibri" w:eastAsia="Calibri" w:hAnsi="Calibri" w:cs="Calibri"/>
+        </w:rPr>
+        <w:t>]</w:t>
+      </w:r>
+      <w:proofErr w:type="gramStart"/>
+      <w:r>
+        <w:rPr>
+          <w:rFonts w:ascii="Calibri" w:eastAsia="Calibri" w:hAnsi="Calibri" w:cs="Calibri"/>
+        </w:rPr>
+        <w:t>]</w:t>
+      </w:r>
+      <w:r>
+        <w:rPr>
+          <w:rFonts w:ascii="Calibri" w:eastAsia="Calibri" w:hAnsi="Calibri" w:cs="Calibri"/>
+        </w:rPr>
+        <w:t xml:space="preserve"> </w:t>
       </w:r>
       <w:r>
         <w:rPr>
@@ -1052,6 +1191,7 @@
         </w:rPr>
         <w:t>,</w:t>
       </w:r>
+      <w:proofErr w:type="gramEnd"/>
       <w:r>
         <w:rPr>
           <w:rFonts w:ascii="Calibri Light" w:hAnsi="Calibri Light" w:cs="Calibri Light"/>
@@ -1085,23 +1225,7 @@
           <w:rFonts w:ascii="Calibri Light" w:hAnsi="Calibri Light" w:cs="Calibri Light"/>
           <w:bCs/>
         </w:rPr>
-        <w:t xml:space="preserve"> considerado un contrato laboral especial a término fijo y </w:t>
-      </w:r>
-      <w:proofErr w:type="gramStart"/>
-      <w:r>
-        <w:rPr>
-          <w:rFonts w:ascii="Calibri Light" w:hAnsi="Calibri Light" w:cs="Calibri Light"/>
-          <w:bCs/>
-        </w:rPr>
-        <w:t>de acuerdo a</w:t>
-      </w:r>
-      <w:proofErr w:type="gramEnd"/>
-      <w:r>
-        <w:rPr>
-          <w:rFonts w:ascii="Calibri Light" w:hAnsi="Calibri Light" w:cs="Calibri Light"/>
-          <w:bCs/>
-        </w:rPr>
-        <w:t xml:space="preserve"> las siguientes cláusulas:</w:t>
+        <w:t xml:space="preserve"> considerado un contrato laboral especial a término fijo y de acuerdo a las siguientes cláusulas:</w:t>
       </w:r>
     </w:p>
     <w:p>
@@ -1186,11 +1310,27 @@
       </w:r>
       <w:r>
         <w:rPr>
-          <w:rFonts w:ascii="Calibri Light" w:hAnsi="Calibri Light" w:cs="Calibri Light"/>
-          <w:b/>
-          <w:bCs/>
-        </w:rPr>
-        <w:t>XXXXXXXXXXXXXXX</w:t>
+          <w:rFonts w:ascii="Calibri" w:eastAsia="Calibri" w:hAnsi="Calibri" w:cs="Calibri"/>
+        </w:rPr>
+        <w:t>[[</w:t>
+      </w:r>
+      <w:r>
+        <w:rPr>
+          <w:rFonts w:ascii="Calibri" w:eastAsia="Calibri" w:hAnsi="Calibri" w:cs="Calibri"/>
+        </w:rPr>
+        <w:t>Cargo</w:t>
+      </w:r>
+      <w:r>
+        <w:rPr>
+          <w:rFonts w:ascii="Calibri" w:eastAsia="Calibri" w:hAnsi="Calibri" w:cs="Calibri"/>
+        </w:rPr>
+        <w:t>]]</w:t>
+      </w:r>
+      <w:r>
+        <w:rPr>
+          <w:rFonts w:ascii="Calibri" w:eastAsia="Calibri" w:hAnsi="Calibri" w:cs="Calibri"/>
+        </w:rPr>
+        <w:t xml:space="preserve"> </w:t>
       </w:r>
       <w:r>
         <w:rPr>
@@ -1208,13 +1348,39 @@
         <w:rPr>
           <w:rFonts w:ascii="Calibri Light" w:hAnsi="Calibri Light" w:cs="Calibri Light"/>
         </w:rPr>
-        <w:t xml:space="preserve"> XXXXXXXXXXXXXX</w:t>
-      </w:r>
-      <w:r>
-        <w:rPr>
-          <w:rFonts w:ascii="Calibri Light" w:hAnsi="Calibri Light" w:cs="Calibri Light"/>
-        </w:rPr>
-        <w:t xml:space="preserve"> mientras su etapa práctica se desarrollará en la </w:t>
+        <w:t xml:space="preserve"> </w:t>
+      </w:r>
+      <w:r>
+        <w:rPr>
+          <w:rFonts w:ascii="Calibri" w:eastAsia="Calibri" w:hAnsi="Calibri" w:cs="Calibri"/>
+        </w:rPr>
+        <w:t>[[</w:t>
+      </w:r>
+      <w:proofErr w:type="spellStart"/>
+      <w:r>
+        <w:rPr>
+          <w:rFonts w:ascii="Calibri" w:eastAsia="Calibri" w:hAnsi="Calibri" w:cs="Calibri"/>
+        </w:rPr>
+        <w:t>Institucion</w:t>
+      </w:r>
+      <w:proofErr w:type="spellEnd"/>
+      <w:r>
+        <w:rPr>
+          <w:rFonts w:ascii="Calibri" w:eastAsia="Calibri" w:hAnsi="Calibri" w:cs="Calibri"/>
+        </w:rPr>
+        <w:t>]]</w:t>
+      </w:r>
+      <w:r>
+        <w:rPr>
+          <w:rFonts w:ascii="Calibri" w:eastAsia="Calibri" w:hAnsi="Calibri" w:cs="Calibri"/>
+        </w:rPr>
+        <w:t xml:space="preserve"> </w:t>
+      </w:r>
+      <w:r>
+        <w:rPr>
+          <w:rFonts w:ascii="Calibri Light" w:hAnsi="Calibri Light" w:cs="Calibri Light"/>
+        </w:rPr>
+        <w:t xml:space="preserve">mientras su etapa práctica se desarrollará en la </w:t>
       </w:r>
       <w:r>
         <w:rPr>
@@ -6422,91 +6588,115 @@
     </w:p>
     <w:p>
       <w:pPr>
-        <w:spacing w:line="240" w:lineRule="auto"/>
-        <w:jc w:val="both"/>
-        <w:rPr>
-          <w:rFonts w:ascii="Calibri Light" w:hAnsi="Calibri Light" w:cs="Calibri Light"/>
-        </w:rPr>
-      </w:pPr>
-    </w:p>
-    <w:p>
-      <w:pPr>
-        <w:spacing w:after="0" w:line="240" w:lineRule="auto"/>
-        <w:jc w:val="both"/>
-        <w:rPr>
-          <w:rFonts w:ascii="Calibri Light" w:hAnsi="Calibri Light" w:cs="Calibri Light"/>
-          <w:b/>
-          <w:bCs/>
-        </w:rPr>
-      </w:pPr>
-      <w:r>
-        <w:rPr>
-          <w:rFonts w:ascii="Calibri Light" w:hAnsi="Calibri Light" w:cs="Calibri Light"/>
-          <w:b/>
-        </w:rPr>
-        <w:t>LAURA CRISTINA CERÓN MUÑO</w:t>
-      </w:r>
-      <w:r>
-        <w:rPr>
-          <w:rFonts w:ascii="Calibri Light" w:hAnsi="Calibri Light" w:cs="Calibri Light"/>
-          <w:b/>
-        </w:rPr>
-        <w:t>Z</w:t>
-      </w:r>
-      <w:r>
-        <w:rPr>
-          <w:rFonts w:ascii="Calibri Light" w:hAnsi="Calibri Light" w:cs="Calibri Light"/>
-          <w:b/>
-          <w:bCs/>
-        </w:rPr>
-        <w:t xml:space="preserve">                                                         </w:t>
-      </w:r>
-      <w:r>
-        <w:rPr>
-          <w:rFonts w:ascii="Calibri Light" w:hAnsi="Calibri Light" w:cs="Calibri Light"/>
-          <w:b/>
-          <w:bCs/>
-        </w:rPr>
-        <w:t>XXXXXXXXXXXXXXXXXX</w:t>
-      </w:r>
-    </w:p>
-    <w:p>
-      <w:pPr>
-        <w:spacing w:after="0" w:line="240" w:lineRule="auto"/>
-        <w:jc w:val="both"/>
-        <w:rPr>
-          <w:rFonts w:ascii="Calibri Light" w:hAnsi="Calibri Light" w:cs="Calibri Light"/>
-          <w:b/>
-        </w:rPr>
-      </w:pPr>
-      <w:r>
-        <w:rPr>
-          <w:rFonts w:ascii="Calibri Light" w:hAnsi="Calibri Light" w:cs="Calibri Light"/>
-          <w:b/>
-        </w:rPr>
-        <w:t xml:space="preserve">C.C </w:t>
-      </w:r>
-      <w:r>
-        <w:rPr>
-          <w:rFonts w:ascii="Calibri Light" w:hAnsi="Calibri Light" w:cs="Calibri Light"/>
-          <w:b/>
-        </w:rPr>
-        <w:t>52.705.312</w:t>
-      </w:r>
-      <w:r>
-        <w:rPr>
-          <w:rFonts w:ascii="Calibri Light" w:hAnsi="Calibri Light" w:cs="Calibri Light"/>
-          <w:b/>
-        </w:rPr>
-        <w:t xml:space="preserve">                                                                                       C.C </w:t>
-      </w:r>
-      <w:r>
-        <w:rPr>
-          <w:rFonts w:ascii="Calibri Light" w:hAnsi="Calibri Light" w:cs="Calibri Light"/>
-          <w:b/>
-          <w:bCs/>
-        </w:rPr>
-        <w:t>XXXXXXXXXXXXXXX</w:t>
+        <w:tabs>
+          <w:tab w:val="left" w:pos="709"/>
+          <w:tab w:val="left" w:pos="1418"/>
+          <w:tab w:val="left" w:pos="2127"/>
+          <w:tab w:val="left" w:pos="2836"/>
+          <w:tab w:val="left" w:pos="3545"/>
+          <w:tab w:val="left" w:pos="4254"/>
+          <w:tab w:val="left" w:pos="4963"/>
+          <w:tab w:val="left" w:pos="5672"/>
+          <w:tab w:val="left" w:pos="6381"/>
+          <w:tab w:val="left" w:pos="7090"/>
+          <w:tab w:val="left" w:pos="7799"/>
+          <w:tab w:val="left" w:pos="8508"/>
+          <w:tab w:val="left" w:pos="9217"/>
+          <w:tab w:val="left" w:pos="9926"/>
+          <w:tab w:val="left" w:pos="10635"/>
+          <w:tab w:val="left" w:pos="11344"/>
+          <w:tab w:val="left" w:pos="12053"/>
+        </w:tabs>
+        <w:rPr>
+          <w:rFonts w:ascii="Calibri" w:eastAsia="Calibri" w:hAnsi="Calibri" w:cs="Calibri"/>
+          <w:b/>
+          <w:bCs/>
+          <w:sz w:val="23"/>
+          <w:szCs w:val="23"/>
+        </w:rPr>
+      </w:pPr>
+      <w:r>
+        <w:rPr>
+          <w:rFonts w:ascii="Calibri" w:eastAsia="Calibri" w:hAnsi="Calibri" w:cs="Calibri"/>
+          <w:b/>
+          <w:bCs/>
+          <w:sz w:val="23"/>
+          <w:szCs w:val="23"/>
+        </w:rPr>
+        <w:t xml:space="preserve">LAURA CRISTINA CERÓN MUÑOZ                                     </w:t>
+      </w:r>
+      <w:r>
+        <w:rPr>
+          <w:rFonts w:ascii="Calibri" w:eastAsia="Calibri" w:hAnsi="Calibri" w:cs="Calibri"/>
+          <w:b/>
+          <w:bCs/>
+          <w:sz w:val="23"/>
+          <w:szCs w:val="23"/>
+        </w:rPr>
+        <w:tab/>
+        <w:t xml:space="preserve">[[Nombre]]    </w:t>
+      </w:r>
+      <w:r>
+        <w:rPr>
+          <w:rFonts w:ascii="Calibri" w:eastAsia="Calibri" w:hAnsi="Calibri" w:cs="Calibri"/>
+          <w:b/>
+          <w:bCs/>
+          <w:sz w:val="23"/>
+          <w:szCs w:val="23"/>
+        </w:rPr>
+        <w:tab/>
+        <w:t xml:space="preserve">                                         </w:t>
+      </w:r>
+    </w:p>
+    <w:p>
+      <w:pPr>
+        <w:tabs>
+          <w:tab w:val="left" w:pos="709"/>
+          <w:tab w:val="left" w:pos="1418"/>
+          <w:tab w:val="left" w:pos="2127"/>
+          <w:tab w:val="left" w:pos="2836"/>
+          <w:tab w:val="left" w:pos="3545"/>
+          <w:tab w:val="left" w:pos="4254"/>
+          <w:tab w:val="left" w:pos="4963"/>
+          <w:tab w:val="left" w:pos="5672"/>
+          <w:tab w:val="left" w:pos="6381"/>
+          <w:tab w:val="left" w:pos="7090"/>
+          <w:tab w:val="left" w:pos="7799"/>
+          <w:tab w:val="left" w:pos="8508"/>
+          <w:tab w:val="left" w:pos="9217"/>
+          <w:tab w:val="left" w:pos="9926"/>
+          <w:tab w:val="left" w:pos="10635"/>
+          <w:tab w:val="left" w:pos="11344"/>
+          <w:tab w:val="left" w:pos="12053"/>
+        </w:tabs>
+        <w:rPr>
+          <w:rFonts w:ascii="Calibri" w:eastAsia="Calibri" w:hAnsi="Calibri" w:cs="Calibri"/>
+          <w:b/>
+          <w:bCs/>
+          <w:sz w:val="23"/>
+          <w:szCs w:val="23"/>
+        </w:rPr>
+      </w:pPr>
+      <w:r>
+        <w:rPr>
+          <w:rFonts w:ascii="Calibri" w:eastAsia="Calibri" w:hAnsi="Calibri" w:cs="Calibri"/>
+          <w:b/>
+          <w:bCs/>
+          <w:sz w:val="23"/>
+          <w:szCs w:val="23"/>
+        </w:rPr>
+        <w:t xml:space="preserve">C.C. No. 52.705.312                                                                </w:t>
+      </w:r>
+      <w:r>
+        <w:rPr>
+          <w:rFonts w:ascii="Calibri" w:eastAsia="Calibri" w:hAnsi="Calibri" w:cs="Calibri"/>
+          <w:b/>
+          <w:bCs/>
+          <w:sz w:val="23"/>
+          <w:szCs w:val="23"/>
+        </w:rPr>
+        <w:tab/>
+        <w:t>C.C. No. [[Cedula]]</w:t>
       </w:r>
     </w:p>
     <w:p>
@@ -6543,7 +6733,7 @@
 </file>
 
 <file path=word/endnotes.xml><?xml version="1.0" encoding="utf-8"?>
-<w:endnotes xmlns:wpc="http://schemas.microsoft.com/office/word/2010/wordprocessingCanvas" xmlns:cx="http://schemas.microsoft.com/office/drawing/2014/chartex" xmlns:cx1="http://schemas.microsoft.com/office/drawing/2015/9/8/chartex" xmlns:cx2="http://schemas.microsoft.com/office/drawing/2015/10/21/chartex" xmlns:cx3="http://schemas.microsoft.com/office/drawing/2016/5/9/chartex" xmlns:cx4="http://schemas.microsoft.com/office/drawing/2016/5/10/chartex" xmlns:cx5="http://schemas.microsoft.com/office/drawing/2016/5/11/chartex" xmlns:cx6="http://schemas.microsoft.com/office/drawing/2016/5/12/chartex" xmlns:cx7="http://schemas.microsoft.com/office/drawing/2016/5/13/chartex" xmlns:cx8="http://schemas.microsoft.com/office/drawing/2016/5/14/chartex" xmlns:mc="http://schemas.openxmlformats.org/markup-compatibility/2006" xmlns:aink="http://schemas.microsoft.com/office/drawing/2016/ink" xmlns:am3d="http://schemas.microsoft.com/office/drawing/2017/model3d" xmlns:o="urn:schemas-microsoft-com:office:office" xmlns:oel="http://schemas.microsoft.com/office/2019/extlst" xmlns:r="http://schemas.openxmlformats.org/officeDocument/2006/relationships" xmlns:m="http://schemas.openxmlformats.org/officeDocument/2006/math" xmlns:v="urn:schemas-microsoft-com:vml" xmlns:wp14="http://schemas.microsoft.com/office/word/2010/wordprocessingDrawing" xmlns:wp="http://schemas.openxmlformats.org/drawingml/2006/wordprocessingDrawing" xmlns:w10="urn:schemas-microsoft-com:office:word" xmlns:w="http://schemas.openxmlformats.org/wordprocessingml/2006/main" xmlns:w14="http://schemas.microsoft.com/office/word/2010/wordml" xmlns:w15="http://schemas.microsoft.com/office/word/2012/wordml" xmlns:w16cex="http://schemas.microsoft.com/office/word/2018/wordml/cex" xmlns:w16cid="http://schemas.microsoft.com/office/word/2016/wordml/cid" xmlns:w16="http://schemas.microsoft.com/office/word/2018/wordml" xmlns:w16du="http://schemas.microsoft.com/office/word/2023/wordml/word16du" xmlns:w16sdtdh="http://schemas.microsoft.com/office/word/2020/wordml/sdtdatahash" xmlns:w16sdtfl="http://schemas.microsoft.com/office/word/2024/wordml/sdtformatlock" xmlns:w16se="http://schemas.microsoft.com/office/word/2015/wordml/symex" xmlns:wpg="http://schemas.microsoft.com/office/word/2010/wordprocessingGroup" xmlns:wpi="http://schemas.microsoft.com/office/word/2010/wordprocessingInk" xmlns:wne="http://schemas.microsoft.com/office/word/2006/wordml" xmlns:wps="http://schemas.microsoft.com/office/word/2010/wordprocessingShape" mc:Ignorable="w14 w15 w16se w16cid w16 w16cex w16sdtdh w16sdtfl w16du wp14">
+<w:endnotes xmlns:wpc="http://schemas.microsoft.com/office/word/2010/wordprocessingCanvas" xmlns:cx="http://schemas.microsoft.com/office/drawing/2014/chartex" xmlns:cx1="http://schemas.microsoft.com/office/drawing/2015/9/8/chartex" xmlns:cx2="http://schemas.microsoft.com/office/drawing/2015/10/21/chartex" xmlns:cx3="http://schemas.microsoft.com/office/drawing/2016/5/9/chartex" xmlns:cx4="http://schemas.microsoft.com/office/drawing/2016/5/10/chartex" xmlns:cx5="http://schemas.microsoft.com/office/drawing/2016/5/11/chartex" xmlns:cx6="http://schemas.microsoft.com/office/drawing/2016/5/12/chartex" xmlns:cx7="http://schemas.microsoft.com/office/drawing/2016/5/13/chartex" xmlns:cx8="http://schemas.microsoft.com/office/drawing/2016/5/14/chartex" xmlns:mc="http://schemas.openxmlformats.org/markup-compatibility/2006" xmlns:aink="http://schemas.microsoft.com/office/drawing/2016/ink" xmlns:am3d="http://schemas.microsoft.com/office/drawing/2017/model3d" xmlns:o="urn:schemas-microsoft-com:office:office" xmlns:r="http://schemas.openxmlformats.org/officeDocument/2006/relationships" xmlns:m="http://schemas.openxmlformats.org/officeDocument/2006/math" xmlns:v="urn:schemas-microsoft-com:vml" xmlns:wp14="http://schemas.microsoft.com/office/word/2010/wordprocessingDrawing" xmlns:wp="http://schemas.openxmlformats.org/drawingml/2006/wordprocessingDrawing" xmlns:w10="urn:schemas-microsoft-com:office:word" xmlns:w="http://schemas.openxmlformats.org/wordprocessingml/2006/main" xmlns:w14="http://schemas.microsoft.com/office/word/2010/wordml" xmlns:w15="http://schemas.microsoft.com/office/word/2012/wordml" xmlns:w16cex="http://schemas.microsoft.com/office/word/2018/wordml/cex" xmlns:w16cid="http://schemas.microsoft.com/office/word/2016/wordml/cid" xmlns:w16="http://schemas.microsoft.com/office/word/2018/wordml" xmlns:w16sdtdh="http://schemas.microsoft.com/office/word/2020/wordml/sdtdatahash" xmlns:w16se="http://schemas.microsoft.com/office/word/2015/wordml/symex" xmlns:wpg="http://schemas.microsoft.com/office/word/2010/wordprocessingGroup" xmlns:wpi="http://schemas.microsoft.com/office/word/2010/wordprocessingInk" xmlns:wne="http://schemas.microsoft.com/office/word/2006/wordml" xmlns:wps="http://schemas.microsoft.com/office/word/2010/wordprocessingShape" mc:Ignorable="w14 w15 w16se w16cid w16 w16cex w16sdtdh wp14">
   <w:endnote w:type="separator" w:id="-1">
     <w:p>
       <w:pPr>
@@ -6575,7 +6765,7 @@
 </file>
 
 <file path=word/footer1.xml><?xml version="1.0" encoding="utf-8"?>
-<w:ftr xmlns:wpc="http://schemas.microsoft.com/office/word/2010/wordprocessingCanvas" xmlns:cx="http://schemas.microsoft.com/office/drawing/2014/chartex" xmlns:cx1="http://schemas.microsoft.com/office/drawing/2015/9/8/chartex" xmlns:cx2="http://schemas.microsoft.com/office/drawing/2015/10/21/chartex" xmlns:cx3="http://schemas.microsoft.com/office/drawing/2016/5/9/chartex" xmlns:cx4="http://schemas.microsoft.com/office/drawing/2016/5/10/chartex" xmlns:cx5="http://schemas.microsoft.com/office/drawing/2016/5/11/chartex" xmlns:cx6="http://schemas.microsoft.com/office/drawing/2016/5/12/chartex" xmlns:cx7="http://schemas.microsoft.com/office/drawing/2016/5/13/chartex" xmlns:cx8="http://schemas.microsoft.com/office/drawing/2016/5/14/chartex" xmlns:mc="http://schemas.openxmlformats.org/markup-compatibility/2006" xmlns:aink="http://schemas.microsoft.com/office/drawing/2016/ink" xmlns:am3d="http://schemas.microsoft.com/office/drawing/2017/model3d" xmlns:o="urn:schemas-microsoft-com:office:office" xmlns:oel="http://schemas.microsoft.com/office/2019/extlst" xmlns:r="http://schemas.openxmlformats.org/officeDocument/2006/relationships" xmlns:m="http://schemas.openxmlformats.org/officeDocument/2006/math" xmlns:v="urn:schemas-microsoft-com:vml" xmlns:wp14="http://schemas.microsoft.com/office/word/2010/wordprocessingDrawing" xmlns:wp="http://schemas.openxmlformats.org/drawingml/2006/wordprocessingDrawing" xmlns:w10="urn:schemas-microsoft-com:office:word" xmlns:w="http://schemas.openxmlformats.org/wordprocessingml/2006/main" xmlns:w14="http://schemas.microsoft.com/office/word/2010/wordml" xmlns:w15="http://schemas.microsoft.com/office/word/2012/wordml" xmlns:w16cex="http://schemas.microsoft.com/office/word/2018/wordml/cex" xmlns:w16cid="http://schemas.microsoft.com/office/word/2016/wordml/cid" xmlns:w16="http://schemas.microsoft.com/office/word/2018/wordml" xmlns:w16du="http://schemas.microsoft.com/office/word/2023/wordml/word16du" xmlns:w16sdtdh="http://schemas.microsoft.com/office/word/2020/wordml/sdtdatahash" xmlns:w16sdtfl="http://schemas.microsoft.com/office/word/2024/wordml/sdtformatlock" xmlns:w16se="http://schemas.microsoft.com/office/word/2015/wordml/symex" xmlns:wpg="http://schemas.microsoft.com/office/word/2010/wordprocessingGroup" xmlns:wpi="http://schemas.microsoft.com/office/word/2010/wordprocessingInk" xmlns:wne="http://schemas.microsoft.com/office/word/2006/wordml" xmlns:wps="http://schemas.microsoft.com/office/word/2010/wordprocessingShape" mc:Ignorable="w14 w15 w16se w16cid w16 w16cex w16sdtdh w16sdtfl w16du wp14">
+<w:ftr xmlns:wpc="http://schemas.microsoft.com/office/word/2010/wordprocessingCanvas" xmlns:cx="http://schemas.microsoft.com/office/drawing/2014/chartex" xmlns:cx1="http://schemas.microsoft.com/office/drawing/2015/9/8/chartex" xmlns:cx2="http://schemas.microsoft.com/office/drawing/2015/10/21/chartex" xmlns:cx3="http://schemas.microsoft.com/office/drawing/2016/5/9/chartex" xmlns:cx4="http://schemas.microsoft.com/office/drawing/2016/5/10/chartex" xmlns:cx5="http://schemas.microsoft.com/office/drawing/2016/5/11/chartex" xmlns:cx6="http://schemas.microsoft.com/office/drawing/2016/5/12/chartex" xmlns:cx7="http://schemas.microsoft.com/office/drawing/2016/5/13/chartex" xmlns:cx8="http://schemas.microsoft.com/office/drawing/2016/5/14/chartex" xmlns:mc="http://schemas.openxmlformats.org/markup-compatibility/2006" xmlns:aink="http://schemas.microsoft.com/office/drawing/2016/ink" xmlns:am3d="http://schemas.microsoft.com/office/drawing/2017/model3d" xmlns:o="urn:schemas-microsoft-com:office:office" xmlns:r="http://schemas.openxmlformats.org/officeDocument/2006/relationships" xmlns:m="http://schemas.openxmlformats.org/officeDocument/2006/math" xmlns:v="urn:schemas-microsoft-com:vml" xmlns:wp14="http://schemas.microsoft.com/office/word/2010/wordprocessingDrawing" xmlns:wp="http://schemas.openxmlformats.org/drawingml/2006/wordprocessingDrawing" xmlns:w10="urn:schemas-microsoft-com:office:word" xmlns:w="http://schemas.openxmlformats.org/wordprocessingml/2006/main" xmlns:w14="http://schemas.microsoft.com/office/word/2010/wordml" xmlns:w15="http://schemas.microsoft.com/office/word/2012/wordml" xmlns:w16cex="http://schemas.microsoft.com/office/word/2018/wordml/cex" xmlns:w16cid="http://schemas.microsoft.com/office/word/2016/wordml/cid" xmlns:w16="http://schemas.microsoft.com/office/word/2018/wordml" xmlns:w16sdtdh="http://schemas.microsoft.com/office/word/2020/wordml/sdtdatahash" xmlns:w16se="http://schemas.microsoft.com/office/word/2015/wordml/symex" xmlns:wpg="http://schemas.microsoft.com/office/word/2010/wordprocessingGroup" xmlns:wpi="http://schemas.microsoft.com/office/word/2010/wordprocessingInk" xmlns:wne="http://schemas.microsoft.com/office/word/2006/wordml" xmlns:wps="http://schemas.microsoft.com/office/word/2010/wordprocessingShape" mc:Ignorable="w14 w15 w16se w16cid w16 w16cex w16sdtdh wp14">
   <w:p>
     <w:pPr>
       <w:pStyle w:val="Piedepgina"/>
@@ -6691,7 +6881,7 @@
               <v:stroke joinstyle="miter"/>
               <v:path gradientshapeok="t" o:connecttype="rect"/>
             </v:shapetype>
-            <v:shape id="Cuadro de texto 1" o:spid="_x0000_s1026" type="#_x0000_t202" style="position:absolute;left:0;text-align:left;margin-left:385.35pt;margin-top:-63.75pt;width:107.4pt;height:20.4pt;z-index:251660288;visibility:visible;mso-wrap-style:square;mso-wrap-distance-left:9pt;mso-wrap-distance-top:0;mso-wrap-distance-right:9pt;mso-wrap-distance-bottom:0;mso-position-horizontal:absolute;mso-position-horizontal-relative:text;mso-position-vertical:absolute;mso-position-vertical-relative:text;v-text-anchor:top" o:gfxdata="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" fillcolor="white [3201]" strokeweight=".5pt">
+            <v:shape id="Cuadro de texto 1" o:spid="_x0000_s1026" type="#_x0000_t202" style="position:absolute;left:0;text-align:left;margin-left:385.35pt;margin-top:-63.75pt;width:107.4pt;height:20.4pt;z-index:251660288;visibility:visible;mso-wrap-style:square;mso-wrap-distance-left:9pt;mso-wrap-distance-top:0;mso-wrap-distance-right:9pt;mso-wrap-distance-bottom:0;mso-position-horizontal:absolute;mso-position-horizontal-relative:text;mso-position-vertical:absolute;mso-position-vertical-relative:text;v-text-anchor:top" o:gfxdata="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" fillcolor="white [3201]" strokeweight=".5pt">
               <v:textbox>
                 <w:txbxContent>
                   <w:p>
@@ -6753,7 +6943,7 @@
 </file>
 
 <file path=word/footnotes.xml><?xml version="1.0" encoding="utf-8"?>
-<w:footnotes xmlns:wpc="http://schemas.microsoft.com/office/word/2010/wordprocessingCanvas" xmlns:cx="http://schemas.microsoft.com/office/drawing/2014/chartex" xmlns:cx1="http://schemas.microsoft.com/office/drawing/2015/9/8/chartex" xmlns:cx2="http://schemas.microsoft.com/office/drawing/2015/10/21/chartex" xmlns:cx3="http://schemas.microsoft.com/office/drawing/2016/5/9/chartex" xmlns:cx4="http://schemas.microsoft.com/office/drawing/2016/5/10/chartex" xmlns:cx5="http://schemas.microsoft.com/office/drawing/2016/5/11/chartex" xmlns:cx6="http://schemas.microsoft.com/office/drawing/2016/5/12/chartex" xmlns:cx7="http://schemas.microsoft.com/office/drawing/2016/5/13/chartex" xmlns:cx8="http://schemas.microsoft.com/office/drawing/2016/5/14/chartex" xmlns:mc="http://schemas.openxmlformats.org/markup-compatibility/2006" xmlns:aink="http://schemas.microsoft.com/office/drawing/2016/ink" xmlns:am3d="http://schemas.microsoft.com/office/drawing/2017/model3d" xmlns:o="urn:schemas-microsoft-com:office:office" xmlns:oel="http://schemas.microsoft.com/office/2019/extlst" xmlns:r="http://schemas.openxmlformats.org/officeDocument/2006/relationships" xmlns:m="http://schemas.openxmlformats.org/officeDocument/2006/math" xmlns:v="urn:schemas-microsoft-com:vml" xmlns:wp14="http://schemas.microsoft.com/office/word/2010/wordprocessingDrawing" xmlns:wp="http://schemas.openxmlformats.org/drawingml/2006/wordprocessingDrawing" xmlns:w10="urn:schemas-microsoft-com:office:word" xmlns:w="http://schemas.openxmlformats.org/wordprocessingml/2006/main" xmlns:w14="http://schemas.microsoft.com/office/word/2010/wordml" xmlns:w15="http://schemas.microsoft.com/office/word/2012/wordml" xmlns:w16cex="http://schemas.microsoft.com/office/word/2018/wordml/cex" xmlns:w16cid="http://schemas.microsoft.com/office/word/2016/wordml/cid" xmlns:w16="http://schemas.microsoft.com/office/word/2018/wordml" xmlns:w16du="http://schemas.microsoft.com/office/word/2023/wordml/word16du" xmlns:w16sdtdh="http://schemas.microsoft.com/office/word/2020/wordml/sdtdatahash" xmlns:w16sdtfl="http://schemas.microsoft.com/office/word/2024/wordml/sdtformatlock" xmlns:w16se="http://schemas.microsoft.com/office/word/2015/wordml/symex" xmlns:wpg="http://schemas.microsoft.com/office/word/2010/wordprocessingGroup" xmlns:wpi="http://schemas.microsoft.com/office/word/2010/wordprocessingInk" xmlns:wne="http://schemas.microsoft.com/office/word/2006/wordml" xmlns:wps="http://schemas.microsoft.com/office/word/2010/wordprocessingShape" mc:Ignorable="w14 w15 w16se w16cid w16 w16cex w16sdtdh w16sdtfl w16du wp14">
+<w:footnotes xmlns:wpc="http://schemas.microsoft.com/office/word/2010/wordprocessingCanvas" xmlns:cx="http://schemas.microsoft.com/office/drawing/2014/chartex" xmlns:cx1="http://schemas.microsoft.com/office/drawing/2015/9/8/chartex" xmlns:cx2="http://schemas.microsoft.com/office/drawing/2015/10/21/chartex" xmlns:cx3="http://schemas.microsoft.com/office/drawing/2016/5/9/chartex" xmlns:cx4="http://schemas.microsoft.com/office/drawing/2016/5/10/chartex" xmlns:cx5="http://schemas.microsoft.com/office/drawing/2016/5/11/chartex" xmlns:cx6="http://schemas.microsoft.com/office/drawing/2016/5/12/chartex" xmlns:cx7="http://schemas.microsoft.com/office/drawing/2016/5/13/chartex" xmlns:cx8="http://schemas.microsoft.com/office/drawing/2016/5/14/chartex" xmlns:mc="http://schemas.openxmlformats.org/markup-compatibility/2006" xmlns:aink="http://schemas.microsoft.com/office/drawing/2016/ink" xmlns:am3d="http://schemas.microsoft.com/office/drawing/2017/model3d" xmlns:o="urn:schemas-microsoft-com:office:office" xmlns:r="http://schemas.openxmlformats.org/officeDocument/2006/relationships" xmlns:m="http://schemas.openxmlformats.org/officeDocument/2006/math" xmlns:v="urn:schemas-microsoft-com:vml" xmlns:wp14="http://schemas.microsoft.com/office/word/2010/wordprocessingDrawing" xmlns:wp="http://schemas.openxmlformats.org/drawingml/2006/wordprocessingDrawing" xmlns:w10="urn:schemas-microsoft-com:office:word" xmlns:w="http://schemas.openxmlformats.org/wordprocessingml/2006/main" xmlns:w14="http://schemas.microsoft.com/office/word/2010/wordml" xmlns:w15="http://schemas.microsoft.com/office/word/2012/wordml" xmlns:w16cex="http://schemas.microsoft.com/office/word/2018/wordml/cex" xmlns:w16cid="http://schemas.microsoft.com/office/word/2016/wordml/cid" xmlns:w16="http://schemas.microsoft.com/office/word/2018/wordml" xmlns:w16sdtdh="http://schemas.microsoft.com/office/word/2020/wordml/sdtdatahash" xmlns:w16se="http://schemas.microsoft.com/office/word/2015/wordml/symex" xmlns:wpg="http://schemas.microsoft.com/office/word/2010/wordprocessingGroup" xmlns:wpi="http://schemas.microsoft.com/office/word/2010/wordprocessingInk" xmlns:wne="http://schemas.microsoft.com/office/word/2006/wordml" xmlns:wps="http://schemas.microsoft.com/office/word/2010/wordprocessingShape" mc:Ignorable="w14 w15 w16se w16cid w16 w16cex w16sdtdh wp14">
   <w:footnote w:type="separator" w:id="-1">
     <w:p>
       <w:pPr>
@@ -6785,7 +6975,7 @@
 </file>
 
 <file path=word/header1.xml><?xml version="1.0" encoding="utf-8"?>
-<w:hdr xmlns:wpc="http://schemas.microsoft.com/office/word/2010/wordprocessingCanvas" xmlns:cx="http://schemas.microsoft.com/office/drawing/2014/chartex" xmlns:cx1="http://schemas.microsoft.com/office/drawing/2015/9/8/chartex" xmlns:cx2="http://schemas.microsoft.com/office/drawing/2015/10/21/chartex" xmlns:cx3="http://schemas.microsoft.com/office/drawing/2016/5/9/chartex" xmlns:cx4="http://schemas.microsoft.com/office/drawing/2016/5/10/chartex" xmlns:cx5="http://schemas.microsoft.com/office/drawing/2016/5/11/chartex" xmlns:cx6="http://schemas.microsoft.com/office/drawing/2016/5/12/chartex" xmlns:cx7="http://schemas.microsoft.com/office/drawing/2016/5/13/chartex" xmlns:cx8="http://schemas.microsoft.com/office/drawing/2016/5/14/chartex" xmlns:mc="http://schemas.openxmlformats.org/markup-compatibility/2006" xmlns:aink="http://schemas.microsoft.com/office/drawing/2016/ink" xmlns:am3d="http://schemas.microsoft.com/office/drawing/2017/model3d" xmlns:o="urn:schemas-microsoft-com:office:office" xmlns:oel="http://schemas.microsoft.com/office/2019/extlst" xmlns:r="http://schemas.openxmlformats.org/officeDocument/2006/relationships" xmlns:m="http://schemas.openxmlformats.org/officeDocument/2006/math" xmlns:v="urn:schemas-microsoft-com:vml" xmlns:wp14="http://schemas.microsoft.com/office/word/2010/wordprocessingDrawing" xmlns:wp="http://schemas.openxmlformats.org/drawingml/2006/wordprocessingDrawing" xmlns:w10="urn:schemas-microsoft-com:office:word" xmlns:w="http://schemas.openxmlformats.org/wordprocessingml/2006/main" xmlns:w14="http://schemas.microsoft.com/office/word/2010/wordml" xmlns:w15="http://schemas.microsoft.com/office/word/2012/wordml" xmlns:w16cex="http://schemas.microsoft.com/office/word/2018/wordml/cex" xmlns:w16cid="http://schemas.microsoft.com/office/word/2016/wordml/cid" xmlns:w16="http://schemas.microsoft.com/office/word/2018/wordml" xmlns:w16du="http://schemas.microsoft.com/office/word/2023/wordml/word16du" xmlns:w16sdtdh="http://schemas.microsoft.com/office/word/2020/wordml/sdtdatahash" xmlns:w16sdtfl="http://schemas.microsoft.com/office/word/2024/wordml/sdtformatlock" xmlns:w16se="http://schemas.microsoft.com/office/word/2015/wordml/symex" xmlns:wpg="http://schemas.microsoft.com/office/word/2010/wordprocessingGroup" xmlns:wpi="http://schemas.microsoft.com/office/word/2010/wordprocessingInk" xmlns:wne="http://schemas.microsoft.com/office/word/2006/wordml" xmlns:wps="http://schemas.microsoft.com/office/word/2010/wordprocessingShape" mc:Ignorable="w14 w15 w16se w16cid w16 w16cex w16sdtdh w16sdtfl w16du wp14">
+<w:hdr xmlns:wpc="http://schemas.microsoft.com/office/word/2010/wordprocessingCanvas" xmlns:cx="http://schemas.microsoft.com/office/drawing/2014/chartex" xmlns:cx1="http://schemas.microsoft.com/office/drawing/2015/9/8/chartex" xmlns:cx2="http://schemas.microsoft.com/office/drawing/2015/10/21/chartex" xmlns:cx3="http://schemas.microsoft.com/office/drawing/2016/5/9/chartex" xmlns:cx4="http://schemas.microsoft.com/office/drawing/2016/5/10/chartex" xmlns:cx5="http://schemas.microsoft.com/office/drawing/2016/5/11/chartex" xmlns:cx6="http://schemas.microsoft.com/office/drawing/2016/5/12/chartex" xmlns:cx7="http://schemas.microsoft.com/office/drawing/2016/5/13/chartex" xmlns:cx8="http://schemas.microsoft.com/office/drawing/2016/5/14/chartex" xmlns:mc="http://schemas.openxmlformats.org/markup-compatibility/2006" xmlns:aink="http://schemas.microsoft.com/office/drawing/2016/ink" xmlns:am3d="http://schemas.microsoft.com/office/drawing/2017/model3d" xmlns:o="urn:schemas-microsoft-com:office:office" xmlns:r="http://schemas.openxmlformats.org/officeDocument/2006/relationships" xmlns:m="http://schemas.openxmlformats.org/officeDocument/2006/math" xmlns:v="urn:schemas-microsoft-com:vml" xmlns:wp14="http://schemas.microsoft.com/office/word/2010/wordprocessingDrawing" xmlns:wp="http://schemas.openxmlformats.org/drawingml/2006/wordprocessingDrawing" xmlns:w10="urn:schemas-microsoft-com:office:word" xmlns:w="http://schemas.openxmlformats.org/wordprocessingml/2006/main" xmlns:w14="http://schemas.microsoft.com/office/word/2010/wordml" xmlns:w15="http://schemas.microsoft.com/office/word/2012/wordml" xmlns:w16cex="http://schemas.microsoft.com/office/word/2018/wordml/cex" xmlns:w16cid="http://schemas.microsoft.com/office/word/2016/wordml/cid" xmlns:w16="http://schemas.microsoft.com/office/word/2018/wordml" xmlns:w16sdtdh="http://schemas.microsoft.com/office/word/2020/wordml/sdtdatahash" xmlns:w16se="http://schemas.microsoft.com/office/word/2015/wordml/symex" xmlns:wpg="http://schemas.microsoft.com/office/word/2010/wordprocessingGroup" xmlns:wpi="http://schemas.microsoft.com/office/word/2010/wordprocessingInk" xmlns:wne="http://schemas.microsoft.com/office/word/2006/wordml" xmlns:wps="http://schemas.microsoft.com/office/word/2010/wordprocessingShape" mc:Ignorable="w14 w15 w16se w16cid w16 w16cex w16sdtdh wp14">
   <w:p>
     <w:pPr>
       <w:pStyle w:val="Encabezado"/>
@@ -6898,7 +7088,7 @@
 </file>
 
 <file path=word/numbering.xml><?xml version="1.0" encoding="utf-8"?>
-<w:numbering xmlns:wpc="http://schemas.microsoft.com/office/word/2010/wordprocessingCanvas" xmlns:cx="http://schemas.microsoft.com/office/drawing/2014/chartex" xmlns:cx1="http://schemas.microsoft.com/office/drawing/2015/9/8/chartex" xmlns:cx2="http://schemas.microsoft.com/office/drawing/2015/10/21/chartex" xmlns:cx3="http://schemas.microsoft.com/office/drawing/2016/5/9/chartex" xmlns:cx4="http://schemas.microsoft.com/office/drawing/2016/5/10/chartex" xmlns:cx5="http://schemas.microsoft.com/office/drawing/2016/5/11/chartex" xmlns:cx6="http://schemas.microsoft.com/office/drawing/2016/5/12/chartex" xmlns:cx7="http://schemas.microsoft.com/office/drawing/2016/5/13/chartex" xmlns:cx8="http://schemas.microsoft.com/office/drawing/2016/5/14/chartex" xmlns:mc="http://schemas.openxmlformats.org/markup-compatibility/2006" xmlns:aink="http://schemas.microsoft.com/office/drawing/2016/ink" xmlns:am3d="http://schemas.microsoft.com/office/drawing/2017/model3d" xmlns:o="urn:schemas-microsoft-com:office:office" xmlns:oel="http://schemas.microsoft.com/office/2019/extlst" xmlns:r="http://schemas.openxmlformats.org/officeDocument/2006/relationships" xmlns:m="http://schemas.openxmlformats.org/officeDocument/2006/math" xmlns:v="urn:schemas-microsoft-com:vml" xmlns:wp14="http://schemas.microsoft.com/office/word/2010/wordprocessingDrawing" xmlns:wp="http://schemas.openxmlformats.org/drawingml/2006/wordprocessingDrawing" xmlns:w10="urn:schemas-microsoft-com:office:word" xmlns:w="http://schemas.openxmlformats.org/wordprocessingml/2006/main" xmlns:w14="http://schemas.microsoft.com/office/word/2010/wordml" xmlns:w15="http://schemas.microsoft.com/office/word/2012/wordml" xmlns:w16cex="http://schemas.microsoft.com/office/word/2018/wordml/cex" xmlns:w16cid="http://schemas.microsoft.com/office/word/2016/wordml/cid" xmlns:w16="http://schemas.microsoft.com/office/word/2018/wordml" xmlns:w16du="http://schemas.microsoft.com/office/word/2023/wordml/word16du" xmlns:w16sdtdh="http://schemas.microsoft.com/office/word/2020/wordml/sdtdatahash" xmlns:w16sdtfl="http://schemas.microsoft.com/office/word/2024/wordml/sdtformatlock" xmlns:w16se="http://schemas.microsoft.com/office/word/2015/wordml/symex" xmlns:wpg="http://schemas.microsoft.com/office/word/2010/wordprocessingGroup" xmlns:wpi="http://schemas.microsoft.com/office/word/2010/wordprocessingInk" xmlns:wne="http://schemas.microsoft.com/office/word/2006/wordml" xmlns:wps="http://schemas.microsoft.com/office/word/2010/wordprocessingShape" mc:Ignorable="w14 w15 w16se w16cid w16 w16cex w16sdtdh w16sdtfl w16du wp14">
+<w:numbering xmlns:wpc="http://schemas.microsoft.com/office/word/2010/wordprocessingCanvas" xmlns:cx="http://schemas.microsoft.com/office/drawing/2014/chartex" xmlns:cx1="http://schemas.microsoft.com/office/drawing/2015/9/8/chartex" xmlns:cx2="http://schemas.microsoft.com/office/drawing/2015/10/21/chartex" xmlns:cx3="http://schemas.microsoft.com/office/drawing/2016/5/9/chartex" xmlns:cx4="http://schemas.microsoft.com/office/drawing/2016/5/10/chartex" xmlns:cx5="http://schemas.microsoft.com/office/drawing/2016/5/11/chartex" xmlns:cx6="http://schemas.microsoft.com/office/drawing/2016/5/12/chartex" xmlns:cx7="http://schemas.microsoft.com/office/drawing/2016/5/13/chartex" xmlns:cx8="http://schemas.microsoft.com/office/drawing/2016/5/14/chartex" xmlns:mc="http://schemas.openxmlformats.org/markup-compatibility/2006" xmlns:aink="http://schemas.microsoft.com/office/drawing/2016/ink" xmlns:am3d="http://schemas.microsoft.com/office/drawing/2017/model3d" xmlns:o="urn:schemas-microsoft-com:office:office" xmlns:r="http://schemas.openxmlformats.org/officeDocument/2006/relationships" xmlns:m="http://schemas.openxmlformats.org/officeDocument/2006/math" xmlns:v="urn:schemas-microsoft-com:vml" xmlns:wp14="http://schemas.microsoft.com/office/word/2010/wordprocessingDrawing" xmlns:wp="http://schemas.openxmlformats.org/drawingml/2006/wordprocessingDrawing" xmlns:w10="urn:schemas-microsoft-com:office:word" xmlns:w="http://schemas.openxmlformats.org/wordprocessingml/2006/main" xmlns:w14="http://schemas.microsoft.com/office/word/2010/wordml" xmlns:w15="http://schemas.microsoft.com/office/word/2012/wordml" xmlns:w16cex="http://schemas.microsoft.com/office/word/2018/wordml/cex" xmlns:w16cid="http://schemas.microsoft.com/office/word/2016/wordml/cid" xmlns:w16="http://schemas.microsoft.com/office/word/2018/wordml" xmlns:w16sdtdh="http://schemas.microsoft.com/office/word/2020/wordml/sdtdatahash" xmlns:w16se="http://schemas.microsoft.com/office/word/2015/wordml/symex" xmlns:wpg="http://schemas.microsoft.com/office/word/2010/wordprocessingGroup" xmlns:wpi="http://schemas.microsoft.com/office/word/2010/wordprocessingInk" xmlns:wne="http://schemas.microsoft.com/office/word/2006/wordml" xmlns:wps="http://schemas.microsoft.com/office/word/2010/wordprocessingShape" mc:Ignorable="w14 w15 w16se w16cid w16 w16cex w16sdtdh wp14">
   <w:abstractNum w:abstractNumId="0" w15:restartNumberingAfterBreak="0">
     <w:nsid w:val="05484FEC"/>
     <w:multiLevelType w:val="hybridMultilevel"/>
@@ -10492,82 +10682,82 @@
       </w:rPr>
     </w:lvl>
   </w:abstractNum>
-  <w:num w:numId="1" w16cid:durableId="1460411861">
+  <w:num w:numId="1">
     <w:abstractNumId w:val="32"/>
   </w:num>
-  <w:num w:numId="2" w16cid:durableId="160435272">
+  <w:num w:numId="2">
     <w:abstractNumId w:val="22"/>
   </w:num>
-  <w:num w:numId="3" w16cid:durableId="649944884">
+  <w:num w:numId="3">
     <w:abstractNumId w:val="28"/>
   </w:num>
-  <w:num w:numId="4" w16cid:durableId="1230726754">
+  <w:num w:numId="4">
     <w:abstractNumId w:val="30"/>
   </w:num>
-  <w:num w:numId="5" w16cid:durableId="1628661139">
+  <w:num w:numId="5">
     <w:abstractNumId w:val="4"/>
   </w:num>
-  <w:num w:numId="6" w16cid:durableId="739206090">
+  <w:num w:numId="6">
     <w:abstractNumId w:val="15"/>
   </w:num>
-  <w:num w:numId="7" w16cid:durableId="1991597691">
+  <w:num w:numId="7">
     <w:abstractNumId w:val="17"/>
   </w:num>
-  <w:num w:numId="8" w16cid:durableId="1077632505">
+  <w:num w:numId="8">
     <w:abstractNumId w:val="7"/>
   </w:num>
-  <w:num w:numId="9" w16cid:durableId="1411273523">
+  <w:num w:numId="9">
     <w:abstractNumId w:val="14"/>
   </w:num>
-  <w:num w:numId="10" w16cid:durableId="1369447346">
+  <w:num w:numId="10">
     <w:abstractNumId w:val="3"/>
   </w:num>
-  <w:num w:numId="11" w16cid:durableId="974407498">
+  <w:num w:numId="11">
     <w:abstractNumId w:val="26"/>
   </w:num>
-  <w:num w:numId="12" w16cid:durableId="200703815">
+  <w:num w:numId="12">
     <w:abstractNumId w:val="29"/>
   </w:num>
-  <w:num w:numId="13" w16cid:durableId="399135436">
+  <w:num w:numId="13">
     <w:abstractNumId w:val="9"/>
   </w:num>
-  <w:num w:numId="14" w16cid:durableId="536165502">
+  <w:num w:numId="14">
     <w:abstractNumId w:val="8"/>
   </w:num>
-  <w:num w:numId="15" w16cid:durableId="1175998736">
+  <w:num w:numId="15">
     <w:abstractNumId w:val="21"/>
   </w:num>
-  <w:num w:numId="16" w16cid:durableId="238056250">
+  <w:num w:numId="16">
     <w:abstractNumId w:val="19"/>
   </w:num>
-  <w:num w:numId="17" w16cid:durableId="1712605225">
+  <w:num w:numId="17">
     <w:abstractNumId w:val="16"/>
   </w:num>
-  <w:num w:numId="18" w16cid:durableId="172380790">
+  <w:num w:numId="18">
     <w:abstractNumId w:val="18"/>
   </w:num>
-  <w:num w:numId="19" w16cid:durableId="858422437">
+  <w:num w:numId="19">
     <w:abstractNumId w:val="0"/>
   </w:num>
-  <w:num w:numId="20" w16cid:durableId="1155417348">
+  <w:num w:numId="20">
     <w:abstractNumId w:val="12"/>
   </w:num>
-  <w:num w:numId="21" w16cid:durableId="920025143">
+  <w:num w:numId="21">
     <w:abstractNumId w:val="20"/>
   </w:num>
-  <w:num w:numId="22" w16cid:durableId="655380842">
+  <w:num w:numId="22">
     <w:abstractNumId w:val="10"/>
   </w:num>
-  <w:num w:numId="23" w16cid:durableId="1725907680">
+  <w:num w:numId="23">
     <w:abstractNumId w:val="2"/>
   </w:num>
-  <w:num w:numId="24" w16cid:durableId="568811958">
+  <w:num w:numId="24">
     <w:abstractNumId w:val="1"/>
   </w:num>
-  <w:num w:numId="25" w16cid:durableId="1230925546">
+  <w:num w:numId="25">
     <w:abstractNumId w:val="23"/>
   </w:num>
-  <w:num w:numId="26" w16cid:durableId="217590606">
+  <w:num w:numId="26">
     <w:abstractNumId w:val="13"/>
     <w:lvlOverride w:ilvl="0">
       <w:startOverride w:val="1"/>
@@ -10597,16 +10787,16 @@
       <w:startOverride w:val="1"/>
     </w:lvlOverride>
   </w:num>
-  <w:num w:numId="27" w16cid:durableId="1192036247">
+  <w:num w:numId="27">
     <w:abstractNumId w:val="24"/>
   </w:num>
-  <w:num w:numId="28" w16cid:durableId="955214067">
+  <w:num w:numId="28">
     <w:abstractNumId w:val="5"/>
   </w:num>
-  <w:num w:numId="29" w16cid:durableId="1774931436">
+  <w:num w:numId="29">
     <w:abstractNumId w:val="6"/>
   </w:num>
-  <w:num w:numId="30" w16cid:durableId="1245724629">
+  <w:num w:numId="30">
     <w:abstractNumId w:val="27"/>
     <w:lvlOverride w:ilvl="0">
       <w:startOverride w:val="1"/>
@@ -10636,7 +10826,7 @@
       <w:startOverride w:val="1"/>
     </w:lvlOverride>
   </w:num>
-  <w:num w:numId="31" w16cid:durableId="1923679774">
+  <w:num w:numId="31">
     <w:abstractNumId w:val="25"/>
     <w:lvlOverride w:ilvl="0">
       <w:startOverride w:val="1"/>
@@ -10666,17 +10856,17 @@
       <w:startOverride w:val="1"/>
     </w:lvlOverride>
   </w:num>
-  <w:num w:numId="32" w16cid:durableId="1982612445">
+  <w:num w:numId="32">
     <w:abstractNumId w:val="11"/>
   </w:num>
-  <w:num w:numId="33" w16cid:durableId="770707984">
+  <w:num w:numId="33">
     <w:abstractNumId w:val="31"/>
   </w:num>
 </w:numbering>
 </file>
 
 <file path=word/styles.xml><?xml version="1.0" encoding="utf-8"?>
-<w:styles xmlns:mc="http://schemas.openxmlformats.org/markup-compatibility/2006" xmlns:r="http://schemas.openxmlformats.org/officeDocument/2006/relationships" xmlns:w="http://schemas.openxmlformats.org/wordprocessingml/2006/main" xmlns:w14="http://schemas.microsoft.com/office/word/2010/wordml" xmlns:w15="http://schemas.microsoft.com/office/word/2012/wordml" xmlns:w16cex="http://schemas.microsoft.com/office/word/2018/wordml/cex" xmlns:w16cid="http://schemas.microsoft.com/office/word/2016/wordml/cid" xmlns:w16="http://schemas.microsoft.com/office/word/2018/wordml" xmlns:w16du="http://schemas.microsoft.com/office/word/2023/wordml/word16du" xmlns:w16sdtdh="http://schemas.microsoft.com/office/word/2020/wordml/sdtdatahash" xmlns:w16sdtfl="http://schemas.microsoft.com/office/word/2024/wordml/sdtformatlock" xmlns:w16se="http://schemas.microsoft.com/office/word/2015/wordml/symex" mc:Ignorable="w14 w15 w16se w16cid w16 w16cex w16sdtdh w16sdtfl w16du">
+<w:styles xmlns:mc="http://schemas.openxmlformats.org/markup-compatibility/2006" xmlns:r="http://schemas.openxmlformats.org/officeDocument/2006/relationships" xmlns:w="http://schemas.openxmlformats.org/wordprocessingml/2006/main" xmlns:w14="http://schemas.microsoft.com/office/word/2010/wordml" xmlns:w15="http://schemas.microsoft.com/office/word/2012/wordml" xmlns:w16cex="http://schemas.microsoft.com/office/word/2018/wordml/cex" xmlns:w16cid="http://schemas.microsoft.com/office/word/2016/wordml/cid" xmlns:w16="http://schemas.microsoft.com/office/word/2018/wordml" xmlns:w16sdtdh="http://schemas.microsoft.com/office/word/2020/wordml/sdtdatahash" xmlns:w16se="http://schemas.microsoft.com/office/word/2015/wordml/symex" mc:Ignorable="w14 w15 w16se w16cid w16 w16cex w16sdtdh">
   <w:docDefaults>
     <w:rPrDefault>
       <w:rPr>
@@ -11941,15 +12131,6 @@
 </file>
 
 <file path=customXml/item1.xml><?xml version="1.0" encoding="utf-8"?>
-<?mso-contentType ?>
-<FormTemplates xmlns="http://schemas.microsoft.com/sharepoint/v3/contenttype/forms">
-  <Display>DocumentLibraryForm</Display>
-  <Edit>DocumentLibraryForm</Edit>
-  <New>DocumentLibraryForm</New>
-</FormTemplates>
-</file>
-
-<file path=customXml/item2.xml><?xml version="1.0" encoding="utf-8"?>
 <ct:contentTypeSchema xmlns:ct="http://schemas.microsoft.com/office/2006/metadata/contentType" xmlns:ma="http://schemas.microsoft.com/office/2006/metadata/properties/metaAttributes" ct:_="" ma:_="" ma:contentTypeName="Documento" ma:contentTypeID="0x010100ADC0E8C736599C42A26D8B6E813C34E2" ma:contentTypeVersion="13" ma:contentTypeDescription="Crear nuevo documento." ma:contentTypeScope="" ma:versionID="527b740b011a8c1f4203bc2a72baddff">
   <xsd:schema xmlns:xsd="http://www.w3.org/2001/XMLSchema" xmlns:xs="http://www.w3.org/2001/XMLSchema" xmlns:p="http://schemas.microsoft.com/office/2006/metadata/properties" xmlns:ns2="d861acd4-5958-4b32-8562-fdadb39bd713" xmlns:ns3="066ccb5b-8359-4381-bc69-015bbf4ecd57" targetNamespace="http://schemas.microsoft.com/office/2006/metadata/properties" ma:root="true" ma:fieldsID="82503d6bf42c5ec6721763a5eb501459" ns2:_="" ns3:_="">
     <xsd:import namespace="d861acd4-5958-4b32-8562-fdadb39bd713"/>
@@ -12156,6 +12337,15 @@
 </ct:contentTypeSchema>
 </file>
 
+<file path=customXml/item2.xml><?xml version="1.0" encoding="utf-8"?>
+<?mso-contentType ?>
+<FormTemplates xmlns="http://schemas.microsoft.com/sharepoint/v3/contenttype/forms">
+  <Display>DocumentLibraryForm</Display>
+  <Edit>DocumentLibraryForm</Edit>
+  <New>DocumentLibraryForm</New>
+</FormTemplates>
+</file>
+
 <file path=customXml/item3.xml><?xml version="1.0" encoding="utf-8"?>
 <p:properties xmlns:p="http://schemas.microsoft.com/office/2006/metadata/properties" xmlns:xsi="http://www.w3.org/2001/XMLSchema-instance" xmlns:pc="http://schemas.microsoft.com/office/infopath/2007/PartnerControls">
   <documentManagement>
@@ -12168,14 +12358,6 @@
 </file>
 
 <file path=customXml/itemProps1.xml><?xml version="1.0" encoding="utf-8"?>
-<ds:datastoreItem xmlns:ds="http://schemas.openxmlformats.org/officeDocument/2006/customXml" ds:itemID="{9224B5AD-2AA2-4170-B0F2-AB98E2632C94}">
-  <ds:schemaRefs>
-    <ds:schemaRef ds:uri="http://schemas.microsoft.com/sharepoint/v3/contenttype/forms"/>
-  </ds:schemaRefs>
-</ds:datastoreItem>
-</file>
-
-<file path=customXml/itemProps2.xml><?xml version="1.0" encoding="utf-8"?>
 <ds:datastoreItem xmlns:ds="http://schemas.openxmlformats.org/officeDocument/2006/customXml" ds:itemID="{F7124DEF-F927-4FD5-8347-44E7790B27C3}">
   <ds:schemaRefs>
     <ds:schemaRef ds:uri="http://schemas.microsoft.com/office/2006/metadata/contentType"/>
@@ -12194,6 +12376,14 @@
 </ds:datastoreItem>
 </file>
 
+<file path=customXml/itemProps2.xml><?xml version="1.0" encoding="utf-8"?>
+<ds:datastoreItem xmlns:ds="http://schemas.openxmlformats.org/officeDocument/2006/customXml" ds:itemID="{9224B5AD-2AA2-4170-B0F2-AB98E2632C94}">
+  <ds:schemaRefs>
+    <ds:schemaRef ds:uri="http://schemas.microsoft.com/sharepoint/v3/contenttype/forms"/>
+  </ds:schemaRefs>
+</ds:datastoreItem>
+</file>
+
 <file path=customXml/itemProps3.xml><?xml version="1.0" encoding="utf-8"?>
 <ds:datastoreItem xmlns:ds="http://schemas.openxmlformats.org/officeDocument/2006/customXml" ds:itemID="{C1A1430D-66B4-46C8-9ABC-B4ED2BE74C3C}">
   <ds:schemaRefs>

</xml_diff>